<commit_message>
Update phone number to (678) 661-5190
</commit_message>
<xml_diff>
--- a/First Choice - Google Ads Plan.docx
+++ b/First Choice - Google Ads Plan.docx
@@ -97,7 +97,7 @@
         <w:spacing w:after="60"/>
       </w:pPr>
       <w:r>
-        <w:t xml:space="preserve">Secondary conversion: phone call via the (678) 478-0973 click-to-call / call extension.</w:t>
+        <w:t xml:space="preserve">Secondary conversion: phone call via the (678) 661-5190 click-to-call / call extension.</w:t>
       </w:r>
     </w:p>
     <w:p>
@@ -6062,7 +6062,7 @@
         <w:spacing w:after="60"/>
       </w:pPr>
       <w:r>
-        <w:t xml:space="preserve">Call extension: (678) 478-0973, call-only reporting enabled</w:t>
+        <w:t xml:space="preserve">Call extension: (678) 661-5190, call-only reporting enabled</w:t>
       </w:r>
     </w:p>
     <w:p>

</xml_diff>